<commit_message>
📄 Update submission docx with correct GitHub link
</commit_message>
<xml_diff>
--- a/VoltRoute_Mini_Project_Submission.docx
+++ b/VoltRoute_Mini_Project_Submission.docx
@@ -313,21 +313,7 @@
           <w:color w:val="0000EE"/>
           <w:sz w:val="22"/>
         </w:rPr>
-        <w:t>https://github.com/shubhamnemade/voltroute</w:t>
-      </w:r>
-    </w:p>
-    <w:p>
-      <w:pPr>
-        <w:spacing w:after="240"/>
-      </w:pPr>
-      <w:r>
-        <w:rPr>
-          <w:rFonts w:ascii="Calibri" w:hAnsi="Calibri"/>
-          <w:b w:val="0"/>
-          <w:color w:val="969696"/>
-          <w:sz w:val="20"/>
-        </w:rPr>
-        <w:t>(Note: Please update this link with the actual GitHub repository URL after pushing the code.)</w:t>
+        <w:t>https://github.com/Shubham-Nemade-24/VoltRoute.git</w:t>
       </w:r>
     </w:p>
     <w:p>

</xml_diff>